<commit_message>
Mini Simulados: lacunas e (__) literais preservados na importação
Co-Authored-By: Claude Opus 5.5 <noreply@anthropic.com>
Claude-Session: https://claude.ai/code/session_01PrL2oFzyxZCCo67jh6zQXk
</commit_message>
<xml_diff>
--- a/tests/fixtures/mini-simulado-exemplo.docx
+++ b/tests/fixtures/mini-simulado-exemplo.docx
@@ -105,6 +105,11 @@
     <w:p>
       <w:r>
         <w:t>02. Observe a figura acima.</w:t>
+      </w:r>
+    </w:p>
+    <w:p>
+      <w:r>
+        <w:t>(__) Lacuna ______ preenchida.</w:t>
       </w:r>
     </w:p>
     <w:p>

</xml_diff>